<commit_message>
Correct Divergent Channels terminology in Spanish mocks
</commit_message>
<xml_diff>
--- a/study-guide/downloads/es/channels-mock-10/03_Doce_canales_divergentes_Mock_10_ES.docx
+++ b/study-guide/downloads/es/channels-mock-10/03_Doce_canales_divergentes_Mock_10_ES.docx
@@ -303,12 +303,12 @@
     </w:p>
     <w:p>
       <w:r>
-        <w:t>D) BL62 demuestra que todos los canales de buceo tienen puntos numerados independientemente.</w:t>
+        <w:t>D) BL62 demuestra que todos los canales divergentes tienen puntos numerados independientemente.</w:t>
       </w:r>
     </w:p>
     <w:p>
       <w:r>
-        <w:t>Feedback: Respuesta correcta: La conexión canal divergente de Vejiga con el Corazón ayuda a explicar indicaciones relacionadas con el espíritu atribuidas a BL62. El vínculo canal divergente de Vejiga con el Corazón se utiliza para ayudar a explicar las indicaciones tradicionales relacionadas con el espíritu de BL62; el punto en sí mismo pertenece al sistema principal del canal Vejiga. BL62 es un punto situado en el canal divergente de Vejiga en lugar del canal principal. — BL62 no es un punto divergente de canales numerados por separado. BL62 trata cada trastorno del Corazón únicamente por su ubicación anatómica. - Una relación de vía ayuda a explicar una indicación, pero no establece de forma independiente el diagnóstico o tratamiento. BL62 demuestra que todos los canales de buceo tienen puntos numerados independientemente. — canales divergentes no poseen puntos de acupuntura numerados independientemente.</w:t>
+        <w:t>Feedback: Respuesta correcta: La conexión canal divergente de Vejiga con el Corazón ayuda a explicar indicaciones relacionadas con el espíritu atribuidas a BL62. El vínculo canal divergente de Vejiga con el Corazón se utiliza para ayudar a explicar las indicaciones tradicionales relacionadas con el espíritu de BL62; el punto en sí mismo pertenece al sistema principal del canal Vejiga. BL62 es un punto situado en el canal divergente de Vejiga en lugar del canal principal. — BL62 no es un punto divergente de canales numerados por separado. BL62 trata cada trastorno del Corazón únicamente por su ubicación anatómica. - Una relación de vía ayuda a explicar una indicación, pero no establece de forma independiente el diagnóstico o tratamiento. BL62 demuestra que todos los canales divergentes tienen puntos numerados independientemente. — canales divergentes no poseen puntos de acupuntura numerados independientemente.</w:t>
       </w:r>
     </w:p>
     <w:sectPr>

</xml_diff>